<commit_message>
barlow/finesst: fix doubled 'to' in budget narrative, final PDF2 re-merge
Co-Authored-By: Claude Fable 5 <noreply@anthropic.com>
</commit_message>
<xml_diff>
--- a/barlow/ultimate_final/budget_and_narrative_final.docx
+++ b/barlow/ultimate_final/budget_and_narrative_final.docx
@@ -378,12 +378,9 @@
         <w:t xml:space="preserve"> to </w:t>
       </w:r>
       <w:proofErr w:type="spellStart"/>
-      <w:r>
-        <w:t>to</w:t>
-      </w:r>
       <w:proofErr w:type="spellEnd"/>
       <w:r>
-        <w:t xml:space="preserve"> support miscellaneous costs associated with this project, including </w:t>
+        <w:t xml:space="preserve">support miscellaneous costs associated with this project, including </w:t>
       </w:r>
       <w:r>
         <w:t xml:space="preserve">photocopy charges, thumb drives, </w:t>

</xml_diff>